<commit_message>
Báo cáo 9 tháng 2026: bỏ ghi chú so sánh cùng kỳ, xuất thêm bản PDF
Co-Authored-By: Claude Opus 5.5 <noreply@anthropic.com>
Claude-Session: https://claude.ai/code/session_01XTgWc2BwAQTQwvqmJj1siL
</commit_message>
<xml_diff>
--- a/99_KET_QUA/2026-10-23_Bao-cao-ket-qua-san-xuat-9-thang-2026.docx
+++ b/99_KET_QUA/2026-10-23_Bao-cao-ket-qua-san-xuat-9-thang-2026.docx
@@ -21158,111 +21158,6 @@
                 <w:szCs w:val="21"/>
               </w:rPr>
               <w:t xml:space="preserve">8</w:t>
-            </w:r>
-          </w:p>
-        </w:tc>
-        <w:tc>
-          <w:tcPr>
-            <w:tcW w:type="dxa" w:w="3628"/>
-            <w:tcBorders>
-              <w:top w:val="single" w:color="000000" w:sz="4"/>
-              <w:left w:val="single" w:color="000000" w:sz="4"/>
-              <w:bottom w:val="single" w:color="000000" w:sz="4"/>
-              <w:right w:val="single" w:color="000000" w:sz="4"/>
-            </w:tcBorders>
-            <w:tcMar>
-              <w:top w:type="dxa" w:w="40"/>
-              <w:left w:type="dxa" w:w="70"/>
-              <w:bottom w:type="dxa" w:w="40"/>
-              <w:right w:type="dxa" w:w="70"/>
-            </w:tcMar>
-            <w:vAlign w:val="center"/>
-          </w:tcPr>
-          <w:p>
-            <w:pPr>
-              <w:jc w:val="left"/>
-            </w:pPr>
-            <w:r>
-              <w:rPr>
-                <w:rFonts w:ascii="Times New Roman" w:cs="Times New Roman" w:eastAsia="Times New Roman" w:hAnsi="Times New Roman"/>
-                <w:b w:val="false"/>
-                <w:bCs w:val="false"/>
-                <w:sz w:val="21"/>
-                <w:szCs w:val="21"/>
-              </w:rPr>
-              <w:t xml:space="preserve">So sánh cùng kỳ năm 2025</w:t>
-            </w:r>
-          </w:p>
-        </w:tc>
-        <w:tc>
-          <w:tcPr>
-            <w:tcW w:type="dxa" w:w="4899"/>
-            <w:tcBorders>
-              <w:top w:val="single" w:color="000000" w:sz="4"/>
-              <w:left w:val="single" w:color="000000" w:sz="4"/>
-              <w:bottom w:val="single" w:color="000000" w:sz="4"/>
-              <w:right w:val="single" w:color="000000" w:sz="4"/>
-            </w:tcBorders>
-            <w:tcMar>
-              <w:top w:type="dxa" w:w="40"/>
-              <w:left w:type="dxa" w:w="70"/>
-              <w:bottom w:type="dxa" w:w="40"/>
-              <w:right w:type="dxa" w:w="70"/>
-            </w:tcMar>
-            <w:vAlign w:val="center"/>
-          </w:tcPr>
-          <w:p>
-            <w:pPr>
-              <w:jc w:val="right"/>
-            </w:pPr>
-            <w:r>
-              <w:rPr>
-                <w:rFonts w:ascii="Times New Roman" w:cs="Times New Roman" w:eastAsia="Times New Roman" w:hAnsi="Times New Roman"/>
-                <w:b w:val="false"/>
-                <w:bCs w:val="false"/>
-                <w:sz w:val="21"/>
-                <w:szCs w:val="21"/>
-              </w:rPr>
-              <w:t xml:space="preserve">Chưa có file số liệu 9 tháng năm 2025 nên chưa so sánh.</w:t>
-            </w:r>
-          </w:p>
-        </w:tc>
-      </w:tr>
-      <w:tr>
-        <w:trPr>
-          <w:cantSplit/>
-          <w:tblHeader w:val="false"/>
-        </w:trPr>
-        <w:tc>
-          <w:tcPr>
-            <w:tcW w:type="dxa" w:w="544"/>
-            <w:tcBorders>
-              <w:top w:val="single" w:color="000000" w:sz="4"/>
-              <w:left w:val="single" w:color="000000" w:sz="4"/>
-              <w:bottom w:val="single" w:color="000000" w:sz="4"/>
-              <w:right w:val="single" w:color="000000" w:sz="4"/>
-            </w:tcBorders>
-            <w:tcMar>
-              <w:top w:type="dxa" w:w="40"/>
-              <w:left w:type="dxa" w:w="70"/>
-              <w:bottom w:type="dxa" w:w="40"/>
-              <w:right w:type="dxa" w:w="70"/>
-            </w:tcMar>
-            <w:vAlign w:val="center"/>
-          </w:tcPr>
-          <w:p>
-            <w:pPr>
-              <w:jc w:val="center"/>
-            </w:pPr>
-            <w:r>
-              <w:rPr>
-                <w:rFonts w:ascii="Times New Roman" w:cs="Times New Roman" w:eastAsia="Times New Roman" w:hAnsi="Times New Roman"/>
-                <w:b w:val="false"/>
-                <w:bCs w:val="false"/>
-                <w:sz w:val="21"/>
-                <w:szCs w:val="21"/>
-              </w:rPr>
-              <w:t xml:space="preserve">9</w:t>
             </w:r>
           </w:p>
         </w:tc>

</xml_diff>